<commit_message>
Erzeugt von automatischer lernOS Produktionskette
</commit_message>
<xml_diff>
--- a/docs/de/download/lernos-neugier-zukunftslust-guide.docx
+++ b/docs/de/download/lernos-neugier-zukunftslust-guide.docx
@@ -10,7 +10,7 @@
         <w:rPr>
           <w:lang w:val="de-de"/>
         </w:rPr>
-        <w:t xml:space="preserve">lernOS Template Leitfaden</w:t>
+        <w:t xml:space="preserve">lernOS Leitfaden Neugier &amp; Zukunftslust</w:t>
       </w:r>
     </w:p>
     <w:p>
@@ -21,7 +21,7 @@
         <w:rPr>
           <w:lang w:val="de-de"/>
         </w:rPr>
-        <w:t xml:space="preserve">Dein eigener lernOS Leitfaden in einem Sprint</w:t>
+        <w:t xml:space="preserve">Dein selbstwirksamer Weg zu mehr Neugier und Zukunftslust in Deinem Leben.</w:t>
       </w:r>
     </w:p>
     <w:p>
@@ -32,7 +32,7 @@
         <w:rPr>
           <w:lang w:val="de-de"/>
         </w:rPr>
-        <w:t xml:space="preserve">Simon Dückert</w:t>
+        <w:t xml:space="preserve">Annika Rupprecht u.v.m.</w:t>
       </w:r>
     </w:p>
     <w:p>
@@ -43,7 +43,7 @@
         <w:rPr>
           <w:lang w:val="de-de"/>
         </w:rPr>
-        <w:t xml:space="preserve">Version 0.2 (01.01.2022)</w:t>
+        <w:t xml:space="preserve">Version 0.1 (11.10.2026)</w:t>
       </w:r>
     </w:p>
     <w:sdt>

</xml_diff>